<commit_message>
Improve yao-crux-skill reasoning and report layout
</commit_message>
<xml_diff>
--- a/skills/yao-crux-skill/reports/github-examples/example-b2b-saas-sales-conversion.docx
+++ b/skills/yao-crux-skill/reports/github-examples/example-b2b-saas-sales-conversion.docx
@@ -1105,6 +1105,113 @@
         <w:pStyle w:val="Heading2"/>
       </w:pPr>
       <w:r>
+        <w:t>先用三问判断是不是主要矛盾</w:t>
+      </w:r>
+    </w:p>
+    <w:tbl>
+      <w:tblPr>
+        <w:tblStyle w:val="TableGrid"/>
+        <w:tblW w:type="auto" w:w="0"/>
+        <w:tblLook w:firstColumn="1" w:firstRow="1" w:lastColumn="0" w:lastRow="0" w:noHBand="0" w:noVBand="1" w:val="04A0"/>
+      </w:tblPr>
+      <w:tblGrid>
+        <w:gridCol w:w="4320"/>
+        <w:gridCol w:w="4320"/>
+      </w:tblGrid>
+      <w:tr>
+        <w:tc>
+          <w:tcPr>
+            <w:tcW w:type="dxa" w:w="4320"/>
+          </w:tcPr>
+          <w:p>
+            <w:r>
+              <w:t>判断</w:t>
+            </w:r>
+          </w:p>
+        </w:tc>
+        <w:tc>
+          <w:tcPr>
+            <w:tcW w:type="dxa" w:w="4320"/>
+          </w:tcPr>
+          <w:p>
+            <w:r>
+              <w:t>结论</w:t>
+            </w:r>
+          </w:p>
+        </w:tc>
+      </w:tr>
+      <w:tr>
+        <w:tc>
+          <w:tcPr>
+            <w:tcW w:type="dxa" w:w="4320"/>
+          </w:tcPr>
+          <w:p>
+            <w:r>
+              <w:t>决定性</w:t>
+            </w:r>
+          </w:p>
+        </w:tc>
+        <w:tc>
+          <w:tcPr>
+            <w:tcW w:type="dxa" w:w="4320"/>
+          </w:tcPr>
+          <w:p>
+            <w:r>
+              <w:t>决定性：高意向客户识别不建立，新增MRR、演示预约率和成交率都很难同步改善。</w:t>
+            </w:r>
+          </w:p>
+        </w:tc>
+      </w:tr>
+      <w:tr>
+        <w:tc>
+          <w:tcPr>
+            <w:tcW w:type="dxa" w:w="4320"/>
+          </w:tcPr>
+          <w:p>
+            <w:r>
+              <w:t>牵引性</w:t>
+            </w:r>
+          </w:p>
+        </w:tc>
+        <w:tc>
+          <w:tcPr>
+            <w:tcW w:type="dxa" w:w="4320"/>
+          </w:tcPr>
+          <w:p>
+            <w:r>
+              <w:t>牵引性：一旦高意向识别和分层跟进跑通，销售无效跟进、市场投放浪费和双方互相指责会一起下降。</w:t>
+            </w:r>
+          </w:p>
+        </w:tc>
+      </w:tr>
+      <w:tr>
+        <w:tc>
+          <w:tcPr>
+            <w:tcW w:type="dxa" w:w="4320"/>
+          </w:tcPr>
+          <w:p>
+            <w:r>
+              <w:t>阶段性</w:t>
+            </w:r>
+          </w:p>
+        </w:tc>
+        <w:tc>
+          <w:tcPr>
+            <w:tcW w:type="dxa" w:w="4320"/>
+          </w:tcPr>
+          <w:p>
+            <w:r>
+              <w:t>阶段性：当前已经从获客扩张进入转化验证期，继续买量不是主线，90天内更应该把现有线索转成有效商机。</w:t>
+            </w:r>
+          </w:p>
+        </w:tc>
+      </w:tr>
+    </w:tbl>
+    <w:p>
+      <w:pPr>
+        <w:pStyle w:val="Heading2"/>
+      </w:pPr>
+      <w:r>
         <w:t>看得见的问题</w:t>
       </w:r>
     </w:p>
@@ -1190,6 +1297,113 @@
         <w:t>如果只要求销售更快跟进，低意向线索会继续占用时间；如果只要求市场继续买量，预算会继续放大低质量漏斗。真正要先解决的是高意向识别和分层跟进。</w:t>
       </w:r>
     </w:p>
+    <w:p>
+      <w:pPr>
+        <w:pStyle w:val="Heading2"/>
+      </w:pPr>
+      <w:r>
+        <w:t>内因、外因和可改变路径</w:t>
+      </w:r>
+    </w:p>
+    <w:tbl>
+      <w:tblPr>
+        <w:tblStyle w:val="TableGrid"/>
+        <w:tblW w:type="auto" w:w="0"/>
+        <w:tblLook w:firstColumn="1" w:firstRow="1" w:lastColumn="0" w:lastRow="0" w:noHBand="0" w:noVBand="1" w:val="04A0"/>
+      </w:tblPr>
+      <w:tblGrid>
+        <w:gridCol w:w="4320"/>
+        <w:gridCol w:w="4320"/>
+      </w:tblGrid>
+      <w:tr>
+        <w:tc>
+          <w:tcPr>
+            <w:tcW w:type="dxa" w:w="4320"/>
+          </w:tcPr>
+          <w:p>
+            <w:r>
+              <w:t>层级</w:t>
+            </w:r>
+          </w:p>
+        </w:tc>
+        <w:tc>
+          <w:tcPr>
+            <w:tcW w:type="dxa" w:w="4320"/>
+          </w:tcPr>
+          <w:p>
+            <w:r>
+              <w:t>内容</w:t>
+            </w:r>
+          </w:p>
+        </w:tc>
+      </w:tr>
+      <w:tr>
+        <w:tc>
+          <w:tcPr>
+            <w:tcW w:type="dxa" w:w="4320"/>
+          </w:tcPr>
+          <w:p>
+            <w:r>
+              <w:t>内部可改变结构</w:t>
+            </w:r>
+          </w:p>
+        </w:tc>
+        <w:tc>
+          <w:tcPr>
+            <w:tcW w:type="dxa" w:w="4320"/>
+          </w:tcPr>
+          <w:p>
+            <w:r>
+              <w:t>ICP、反ICP和线索评分标准；A/B/C类线索分层跟进规则；市场、销售和销售运营共用的漏斗复盘机制</w:t>
+            </w:r>
+          </w:p>
+        </w:tc>
+      </w:tr>
+      <w:tr>
+        <w:tc>
+          <w:tcPr>
+            <w:tcW w:type="dxa" w:w="4320"/>
+          </w:tcPr>
+          <w:p>
+            <w:r>
+              <w:t>外部硬条件</w:t>
+            </w:r>
+          </w:p>
+        </w:tc>
+        <w:tc>
+          <w:tcPr>
+            <w:tcW w:type="dxa" w:w="4320"/>
+          </w:tcPr>
+          <w:p>
+            <w:r>
+              <w:t>客户预算周期和采购权限无法由团队直接控制；市场渠道线索质量有波动；产品定价和功能短期不能大改</w:t>
+            </w:r>
+          </w:p>
+        </w:tc>
+      </w:tr>
+      <w:tr>
+        <w:tc>
+          <w:tcPr>
+            <w:tcW w:type="dxa" w:w="4320"/>
+          </w:tcPr>
+          <w:p>
+            <w:r>
+              <w:t>外因如何通过内因起作用</w:t>
+            </w:r>
+          </w:p>
+        </w:tc>
+        <w:tc>
+          <w:tcPr>
+            <w:tcW w:type="dxa" w:w="4320"/>
+          </w:tcPr>
+          <w:p>
+            <w:r>
+              <w:t>外部渠道和客户预算会通过线索识别、跟进优先级和价值证明能力影响成交结果；先改内部识别与分层，才能把同样流量转成更高质量的销售机会。</w:t>
+            </w:r>
+          </w:p>
+        </w:tc>
+      </w:tr>
+    </w:tbl>
     <w:p>
       <w:pPr>
         <w:pStyle w:val="Heading2"/>
@@ -1747,9 +1961,106 @@
     </w:p>
     <w:p>
       <w:r>
-        <w:t>把资源从单纯买量和无差别外呼，转向高意向识别、分层跟进和漏斗反馈。</w:t>
+        <w:t>采用激进倾斜：把资源从单纯买量和无差别外呼大幅抽出，65%的高杠杆精力主攻高意向识别、分层跟进和漏斗反馈。</w:t>
       </w:r>
     </w:p>
+    <w:tbl>
+      <w:tblPr>
+        <w:tblStyle w:val="TableGrid"/>
+        <w:tblW w:type="auto" w:w="0"/>
+        <w:tblLook w:firstColumn="1" w:firstRow="1" w:lastColumn="0" w:lastRow="0" w:noHBand="0" w:noVBand="1" w:val="04A0"/>
+      </w:tblPr>
+      <w:tblGrid>
+        <w:gridCol w:w="2160"/>
+        <w:gridCol w:w="2160"/>
+        <w:gridCol w:w="2160"/>
+        <w:gridCol w:w="2160"/>
+      </w:tblGrid>
+      <w:tr>
+        <w:tc>
+          <w:tcPr>
+            <w:tcW w:type="dxa" w:w="2160"/>
+          </w:tcPr>
+          <w:p>
+            <w:r>
+              <w:t>倾斜强度</w:t>
+            </w:r>
+          </w:p>
+        </w:tc>
+        <w:tc>
+          <w:tcPr>
+            <w:tcW w:type="dxa" w:w="2160"/>
+          </w:tcPr>
+          <w:p>
+            <w:r>
+              <w:t>主攻主要矛盾</w:t>
+            </w:r>
+          </w:p>
+        </w:tc>
+        <w:tc>
+          <w:tcPr>
+            <w:tcW w:type="dxa" w:w="2160"/>
+          </w:tcPr>
+          <w:p>
+            <w:r>
+              <w:t>压缩次要矛盾</w:t>
+            </w:r>
+          </w:p>
+        </w:tc>
+        <w:tc>
+          <w:tcPr>
+            <w:tcW w:type="dxa" w:w="2160"/>
+          </w:tcPr>
+          <w:p>
+            <w:r>
+              <w:t>证据与监控</w:t>
+            </w:r>
+          </w:p>
+        </w:tc>
+      </w:tr>
+      <w:tr>
+        <w:tc>
+          <w:tcPr>
+            <w:tcW w:type="dxa" w:w="2160"/>
+          </w:tcPr>
+          <w:p>
+            <w:r>
+              <w:t>激进倾斜</w:t>
+            </w:r>
+          </w:p>
+        </w:tc>
+        <w:tc>
+          <w:tcPr>
+            <w:tcW w:type="dxa" w:w="2160"/>
+          </w:tcPr>
+          <w:p>
+            <w:r>
+              <w:t>65%</w:t>
+            </w:r>
+          </w:p>
+        </w:tc>
+        <w:tc>
+          <w:tcPr>
+            <w:tcW w:type="dxa" w:w="2160"/>
+          </w:tcPr>
+          <w:p>
+            <w:r>
+              <w:t>20%</w:t>
+            </w:r>
+          </w:p>
+        </w:tc>
+        <w:tc>
+          <w:tcPr>
+            <w:tcW w:type="dxa" w:w="2160"/>
+          </w:tcPr>
+          <w:p>
+            <w:r>
+              <w:t>15%</w:t>
+            </w:r>
+          </w:p>
+        </w:tc>
+      </w:tr>
+    </w:tbl>
     <w:tbl>
       <w:tblPr>
         <w:tblStyle w:val="TableGrid"/>
@@ -1831,7 +2142,7 @@
           </w:tcPr>
           <w:p>
             <w:r>
-              <w:t>20%</w:t>
+              <w:t>10%</w:t>
             </w:r>
           </w:p>
         </w:tc>
@@ -1841,7 +2152,7 @@
           </w:tcPr>
           <w:p>
             <w:r>
-              <w:t>-20%</w:t>
+              <w:t>-30%</w:t>
             </w:r>
           </w:p>
         </w:tc>
@@ -1873,7 +2184,7 @@
           </w:tcPr>
           <w:p>
             <w:r>
-              <w:t>15%</w:t>
+              <w:t>10%</w:t>
             </w:r>
           </w:p>
         </w:tc>
@@ -1883,7 +2194,7 @@
           </w:tcPr>
           <w:p>
             <w:r>
-              <w:t>-20%</w:t>
+              <w:t>-25%</w:t>
             </w:r>
           </w:p>
         </w:tc>
@@ -1896,6 +2207,48 @@
           <w:p>
             <w:r>
               <w:t>ICP和评分</w:t>
+            </w:r>
+          </w:p>
+        </w:tc>
+        <w:tc>
+          <w:tcPr>
+            <w:tcW w:type="dxa" w:w="2160"/>
+          </w:tcPr>
+          <w:p>
+            <w:r>
+              <w:t>10%</w:t>
+            </w:r>
+          </w:p>
+        </w:tc>
+        <w:tc>
+          <w:tcPr>
+            <w:tcW w:type="dxa" w:w="2160"/>
+          </w:tcPr>
+          <w:p>
+            <w:r>
+              <w:t>35%</w:t>
+            </w:r>
+          </w:p>
+        </w:tc>
+        <w:tc>
+          <w:tcPr>
+            <w:tcW w:type="dxa" w:w="2160"/>
+          </w:tcPr>
+          <w:p>
+            <w:r>
+              <w:t>+25%</w:t>
+            </w:r>
+          </w:p>
+        </w:tc>
+      </w:tr>
+      <w:tr>
+        <w:tc>
+          <w:tcPr>
+            <w:tcW w:type="dxa" w:w="2160"/>
+          </w:tcPr>
+          <w:p>
+            <w:r>
+              <w:t>高意向转化</w:t>
             </w:r>
           </w:p>
         </w:tc>
@@ -1937,48 +2290,6 @@
           </w:tcPr>
           <w:p>
             <w:r>
-              <w:t>高意向转化</w:t>
-            </w:r>
-          </w:p>
-        </w:tc>
-        <w:tc>
-          <w:tcPr>
-            <w:tcW w:type="dxa" w:w="2160"/>
-          </w:tcPr>
-          <w:p>
-            <w:r>
-              <w:t>10%</w:t>
-            </w:r>
-          </w:p>
-        </w:tc>
-        <w:tc>
-          <w:tcPr>
-            <w:tcW w:type="dxa" w:w="2160"/>
-          </w:tcPr>
-          <w:p>
-            <w:r>
-              <w:t>25%</w:t>
-            </w:r>
-          </w:p>
-        </w:tc>
-        <w:tc>
-          <w:tcPr>
-            <w:tcW w:type="dxa" w:w="2160"/>
-          </w:tcPr>
-          <w:p>
-            <w:r>
-              <w:t>+15%</w:t>
-            </w:r>
-          </w:p>
-        </w:tc>
-      </w:tr>
-      <w:tr>
-        <w:tc>
-          <w:tcPr>
-            <w:tcW w:type="dxa" w:w="2160"/>
-          </w:tcPr>
-          <w:p>
-            <w:r>
               <w:t>漏斗复盘</w:t>
             </w:r>
           </w:p>
@@ -1999,7 +2310,7 @@
           </w:tcPr>
           <w:p>
             <w:r>
-              <w:t>10%</w:t>
+              <w:t>15%</w:t>
             </w:r>
           </w:p>
         </w:tc>
@@ -2009,7 +2320,7 @@
           </w:tcPr>
           <w:p>
             <w:r>
-              <w:t>+5%</w:t>
+              <w:t>+10%</w:t>
             </w:r>
           </w:p>
         </w:tc>
@@ -2030,18 +2341,19 @@
         <w:tblLook w:firstColumn="1" w:firstRow="1" w:lastColumn="0" w:lastRow="0" w:noHBand="0" w:noVBand="1" w:val="04A0"/>
       </w:tblPr>
       <w:tblGrid>
-        <w:gridCol w:w="1234"/>
-        <w:gridCol w:w="1234"/>
-        <w:gridCol w:w="1234"/>
-        <w:gridCol w:w="1234"/>
-        <w:gridCol w:w="1234"/>
-        <w:gridCol w:w="1234"/>
-        <w:gridCol w:w="1234"/>
+        <w:gridCol w:w="1080"/>
+        <w:gridCol w:w="1080"/>
+        <w:gridCol w:w="1080"/>
+        <w:gridCol w:w="1080"/>
+        <w:gridCol w:w="1080"/>
+        <w:gridCol w:w="1080"/>
+        <w:gridCol w:w="1080"/>
+        <w:gridCol w:w="1080"/>
       </w:tblGrid>
       <w:tr>
         <w:tc>
           <w:tcPr>
-            <w:tcW w:type="dxa" w:w="1234"/>
+            <w:tcW w:type="dxa" w:w="1080"/>
           </w:tcPr>
           <w:p>
             <w:r>
@@ -2051,7 +2363,17 @@
         </w:tc>
         <w:tc>
           <w:tcPr>
-            <w:tcW w:type="dxa" w:w="1234"/>
+            <w:tcW w:type="dxa" w:w="1080"/>
+          </w:tcPr>
+          <w:p>
+            <w:r>
+              <w:t>改变主要方面</w:t>
+            </w:r>
+          </w:p>
+        </w:tc>
+        <w:tc>
+          <w:tcPr>
+            <w:tcW w:type="dxa" w:w="1080"/>
           </w:tcPr>
           <w:p>
             <w:r>
@@ -2061,7 +2383,7 @@
         </w:tc>
         <w:tc>
           <w:tcPr>
-            <w:tcW w:type="dxa" w:w="1234"/>
+            <w:tcW w:type="dxa" w:w="1080"/>
           </w:tcPr>
           <w:p>
             <w:r>
@@ -2071,7 +2393,7 @@
         </w:tc>
         <w:tc>
           <w:tcPr>
-            <w:tcW w:type="dxa" w:w="1234"/>
+            <w:tcW w:type="dxa" w:w="1080"/>
           </w:tcPr>
           <w:p>
             <w:r>
@@ -2081,7 +2403,7 @@
         </w:tc>
         <w:tc>
           <w:tcPr>
-            <w:tcW w:type="dxa" w:w="1234"/>
+            <w:tcW w:type="dxa" w:w="1080"/>
           </w:tcPr>
           <w:p>
             <w:r>
@@ -2091,7 +2413,7 @@
         </w:tc>
         <w:tc>
           <w:tcPr>
-            <w:tcW w:type="dxa" w:w="1234"/>
+            <w:tcW w:type="dxa" w:w="1080"/>
           </w:tcPr>
           <w:p>
             <w:r>
@@ -2101,7 +2423,7 @@
         </w:tc>
         <w:tc>
           <w:tcPr>
-            <w:tcW w:type="dxa" w:w="1234"/>
+            <w:tcW w:type="dxa" w:w="1080"/>
           </w:tcPr>
           <w:p>
             <w:r>
@@ -2113,7 +2435,7 @@
       <w:tr>
         <w:tc>
           <w:tcPr>
-            <w:tcW w:type="dxa" w:w="1234"/>
+            <w:tcW w:type="dxa" w:w="1080"/>
           </w:tcPr>
           <w:p>
             <w:r>
@@ -2123,7 +2445,17 @@
         </w:tc>
         <w:tc>
           <w:tcPr>
-            <w:tcW w:type="dxa" w:w="1234"/>
+            <w:tcW w:type="dxa" w:w="1080"/>
+          </w:tcPr>
+          <w:p>
+            <w:r>
+              <w:t>削弱“高意向客户识别能力不足”这一主要方面，让销售时间开始向高价值线索集中。</w:t>
+            </w:r>
+          </w:p>
+        </w:tc>
+        <w:tc>
+          <w:tcPr>
+            <w:tcW w:type="dxa" w:w="1080"/>
           </w:tcPr>
           <w:p>
             <w:r>
@@ -2133,7 +2465,7 @@
         </w:tc>
         <w:tc>
           <w:tcPr>
-            <w:tcW w:type="dxa" w:w="1234"/>
+            <w:tcW w:type="dxa" w:w="1080"/>
           </w:tcPr>
           <w:p>
             <w:r>
@@ -2143,7 +2475,7 @@
         </w:tc>
         <w:tc>
           <w:tcPr>
-            <w:tcW w:type="dxa" w:w="1234"/>
+            <w:tcW w:type="dxa" w:w="1080"/>
           </w:tcPr>
           <w:p>
             <w:r>
@@ -2153,7 +2485,7 @@
         </w:tc>
         <w:tc>
           <w:tcPr>
-            <w:tcW w:type="dxa" w:w="1234"/>
+            <w:tcW w:type="dxa" w:w="1080"/>
           </w:tcPr>
           <w:p>
             <w:r>
@@ -2163,7 +2495,7 @@
         </w:tc>
         <w:tc>
           <w:tcPr>
-            <w:tcW w:type="dxa" w:w="1234"/>
+            <w:tcW w:type="dxa" w:w="1080"/>
           </w:tcPr>
           <w:p>
             <w:r>
@@ -2173,7 +2505,7 @@
         </w:tc>
         <w:tc>
           <w:tcPr>
-            <w:tcW w:type="dxa" w:w="1234"/>
+            <w:tcW w:type="dxa" w:w="1080"/>
           </w:tcPr>
           <w:p>
             <w:r>
@@ -2185,7 +2517,7 @@
       <w:tr>
         <w:tc>
           <w:tcPr>
-            <w:tcW w:type="dxa" w:w="1234"/>
+            <w:tcW w:type="dxa" w:w="1080"/>
           </w:tcPr>
           <w:p>
             <w:r>
@@ -2195,7 +2527,17 @@
         </w:tc>
         <w:tc>
           <w:tcPr>
-            <w:tcW w:type="dxa" w:w="1234"/>
+            <w:tcW w:type="dxa" w:w="1080"/>
+          </w:tcPr>
+          <w:p>
+            <w:r>
+              <w:t>把无差别跟进改成分层跟进，直接改变高意向识别不足对成交的支配作用。</w:t>
+            </w:r>
+          </w:p>
+        </w:tc>
+        <w:tc>
+          <w:tcPr>
+            <w:tcW w:type="dxa" w:w="1080"/>
           </w:tcPr>
           <w:p>
             <w:r>
@@ -2205,7 +2547,7 @@
         </w:tc>
         <w:tc>
           <w:tcPr>
-            <w:tcW w:type="dxa" w:w="1234"/>
+            <w:tcW w:type="dxa" w:w="1080"/>
           </w:tcPr>
           <w:p>
             <w:r>
@@ -2215,7 +2557,7 @@
         </w:tc>
         <w:tc>
           <w:tcPr>
-            <w:tcW w:type="dxa" w:w="1234"/>
+            <w:tcW w:type="dxa" w:w="1080"/>
           </w:tcPr>
           <w:p>
             <w:r>
@@ -2225,7 +2567,7 @@
         </w:tc>
         <w:tc>
           <w:tcPr>
-            <w:tcW w:type="dxa" w:w="1234"/>
+            <w:tcW w:type="dxa" w:w="1080"/>
           </w:tcPr>
           <w:p>
             <w:r>
@@ -2235,7 +2577,7 @@
         </w:tc>
         <w:tc>
           <w:tcPr>
-            <w:tcW w:type="dxa" w:w="1234"/>
+            <w:tcW w:type="dxa" w:w="1080"/>
           </w:tcPr>
           <w:p>
             <w:r>
@@ -2245,7 +2587,7 @@
         </w:tc>
         <w:tc>
           <w:tcPr>
-            <w:tcW w:type="dxa" w:w="1234"/>
+            <w:tcW w:type="dxa" w:w="1080"/>
           </w:tcPr>
           <w:p>
             <w:r>
@@ -2257,7 +2599,7 @@
       <w:tr>
         <w:tc>
           <w:tcPr>
-            <w:tcW w:type="dxa" w:w="1234"/>
+            <w:tcW w:type="dxa" w:w="1080"/>
           </w:tcPr>
           <w:p>
             <w:r>
@@ -2267,7 +2609,17 @@
         </w:tc>
         <w:tc>
           <w:tcPr>
-            <w:tcW w:type="dxa" w:w="1234"/>
+            <w:tcW w:type="dxa" w:w="1080"/>
+          </w:tcPr>
+          <w:p>
+            <w:r>
+              <w:t>用同一张漏斗账持续校正高意向标准，防止市场继续被线索数量主导。</w:t>
+            </w:r>
+          </w:p>
+        </w:tc>
+        <w:tc>
+          <w:tcPr>
+            <w:tcW w:type="dxa" w:w="1080"/>
           </w:tcPr>
           <w:p>
             <w:r>
@@ -2277,7 +2629,7 @@
         </w:tc>
         <w:tc>
           <w:tcPr>
-            <w:tcW w:type="dxa" w:w="1234"/>
+            <w:tcW w:type="dxa" w:w="1080"/>
           </w:tcPr>
           <w:p>
             <w:r>
@@ -2287,7 +2639,7 @@
         </w:tc>
         <w:tc>
           <w:tcPr>
-            <w:tcW w:type="dxa" w:w="1234"/>
+            <w:tcW w:type="dxa" w:w="1080"/>
           </w:tcPr>
           <w:p>
             <w:r>
@@ -2297,7 +2649,7 @@
         </w:tc>
         <w:tc>
           <w:tcPr>
-            <w:tcW w:type="dxa" w:w="1234"/>
+            <w:tcW w:type="dxa" w:w="1080"/>
           </w:tcPr>
           <w:p>
             <w:r>
@@ -2307,7 +2659,7 @@
         </w:tc>
         <w:tc>
           <w:tcPr>
-            <w:tcW w:type="dxa" w:w="1234"/>
+            <w:tcW w:type="dxa" w:w="1080"/>
           </w:tcPr>
           <w:p>
             <w:r>
@@ -2317,7 +2669,7 @@
         </w:tc>
         <w:tc>
           <w:tcPr>
-            <w:tcW w:type="dxa" w:w="1234"/>
+            <w:tcW w:type="dxa" w:w="1080"/>
           </w:tcPr>
           <w:p>
             <w:r>

</xml_diff>